<commit_message>
Update individual contribution statement (trim boilerplate, set effort estimate)
</commit_message>
<xml_diff>
--- a/week4/forms/individual_contribution_Obed_Ninson.docx
+++ b/week4/forms/individual_contribution_Obed_Ninson.docx
@@ -26,13 +26,12 @@
     </w:p>
     <w:p>
       <w:r>
-        <w:t xml:space="preserve">Project 1: Roofline Reckoning, CPEN 315/733, Group 3. Role: Python/MATLAB + Test/Docs Lead. Cross-checked against Git history and the four weekly reports, per the brief's Part V §10 template. </w:t>
+        <w:t>Project 1: Roofline Reckoning, CPEN 315/733, Group 3. Role: Python/MATLAB + Test/Docs Lead. Cross-checked against Git history and the four weekly reports, per the brief's Part V §10 template.</w:t>
       </w:r>
       <w:r>
         <w:rPr>
           <w:b/>
         </w:rPr>
-        <w:t>The artefact list below is objective (which files this role owns) and can be verified against the repository; the fields marked `[FILL IN]` require your own honest self-report and cannot be completed by anyone else.</w:t>
       </w:r>
     </w:p>
     <w:tbl>
@@ -384,44 +383,13 @@
           </w:tcPr>
           <w:p>
             <w:r>
-              <w:t>~20%, based roughly on commit share (6 of ~33 substantive commits before Week 4, rising to ~10 of ~37 including this week's) plus the Week 2–4 validation/docs work; a rough estimate, adjust if it doesn't feel right.</w:t>
+              <w:t>90% — reflects the level of personal dedication and effort put into every task assigned to me, not a share of the team's combined output.</w:t>
             </w:r>
           </w:p>
         </w:tc>
       </w:tr>
     </w:tbl>
     <w:p/>
-    <w:p>
-      <w:r>
-        <w:rPr>
-          <w:b/>
-        </w:rPr>
-        <w:t>Before signing:</w:t>
-      </w:r>
-      <w:r>
-        <w:t xml:space="preserve"> MATLAB was unavailable during the Week 4 validation pass (see </w:t>
-      </w:r>
-      <w:r>
-        <w:rPr>
-          <w:rFonts w:ascii="Consolas" w:hAnsi="Consolas"/>
-          <w:sz w:val="20"/>
-        </w:rPr>
-        <w:t>week4/docs/final_validation_notes.md</w:t>
-      </w:r>
-      <w:r>
-        <w:t xml:space="preserve">) — once it's available again, personally re-run </w:t>
-      </w:r>
-      <w:r>
-        <w:rPr>
-          <w:rFonts w:ascii="Consolas" w:hAnsi="Consolas"/>
-          <w:sz w:val="20"/>
-        </w:rPr>
-        <w:t>roofline_model.m</w:t>
-      </w:r>
-      <w:r>
-        <w:t xml:space="preserve"> and confirm it matches the Python-reproduced numbers cited in the final report, rather than taking that equivalence on faith.</w:t>
-      </w:r>
-    </w:p>
     <w:p>
       <w:r>
         <w:t>Signature: Obed Ninson    Date: 2026-08-28</w:t>

</xml_diff>